<commit_message>
Zielgruppe: alle Heilberufe statt Pflege-Schwerpunkt; Skripte 31 und 33 angepasst
Co-Authored-By: Claude Sonnet 5.5 <noreply@anthropic.com>
Claude-Session: https://claude.ai/code/session_012LryjyFxwvHDwe5ozKVgKB
</commit_message>
<xml_diff>
--- a/.claude/skills/run-skill-generator/skripte/Skripte 31 bis 35.docx
+++ b/.claude/skills/run-skill-generator/skripte/Skripte 31 bis 35.docx
@@ -118,7 +118,7 @@
         <w:br/>
       </w:r>
       <w:r>
-        <w:t xml:space="preserve">„Meine Tante ist Krankenschwester“</w:t>
+        <w:t xml:space="preserve">„Mein Hausarzt ist mein Kumpel“</w:t>
       </w:r>
     </w:p>
     <w:p>
@@ -172,7 +172,7 @@
         <w:br/>
       </w:r>
       <w:r>
-        <w:t xml:space="preserve">Gesprochen: B: „Ich kenn mich bei Ärzten total aus. Meine Tante ist Krankenschwester.“</w:t>
+        <w:t xml:space="preserve">Gesprochen: B: „Ich kenn mich bei Ärzten total aus. Mein Hausarzt ist mein Kumpel.“</w:t>
       </w:r>
       <w:r>
         <w:br/>
@@ -536,13 +536,13 @@
       </w:r>
     </w:p>
     <w:bookmarkEnd w:id="21"/>
-    <w:bookmarkStart w:id="22" w:name="X6f0d4deebaeb0c76eb9b8d6c94893f46f43aee3"/>
+    <w:bookmarkStart w:id="22" w:name="Xd2a8b5af15688582ec599759294ad7daec02794"/>
     <w:p>
       <w:pPr>
         <w:pStyle w:val="Heading3"/>
       </w:pPr>
       <w:r>
-        <w:t xml:space="preserve">Skript 33 von 35 · Zwei Pflegekräfte, 55 € Unterschied</w:t>
+        <w:t xml:space="preserve">Skript 33 von 35 · Zwei Kolleginnen, 55 € Unterschied</w:t>
       </w:r>
     </w:p>
     <w:p>
@@ -550,7 +550,7 @@
         <w:pStyle w:val="FirstParagraph"/>
       </w:pPr>
       <w:r>
-        <w:t xml:space="preserve">Pflege · Zwei-Personen-Vergleich · Identität zuerst · 25 s · Z</w:t>
+        <w:t xml:space="preserve">Alle Angestellten im Gesundheitswesen (angestellte Ärzte, MFA, Pflege) · Zwei-Personen-Vergleich · Situation zuerst · 25 s · Z</w:t>
       </w:r>
     </w:p>
     <w:p>
@@ -568,7 +568,7 @@
         <w:br/>
       </w:r>
       <w:r>
-        <w:t xml:space="preserve">Zwei Menschen, gleiche Lage (US-Studienkredit-Videos): Entscheidung wird sichtbar. Dazu unsere stärkste Spur, Pflege-Identität (Ø 2.085 Aufrufe, Skip 39,8 %).</w:t>
+        <w:t xml:space="preserve">Zwei Menschen, gleiche Lage (US-Studienkredit-Videos): Entscheidung wird sichtbar. Dazu die Situations-Hook-Mechanik, die bei uns am besten läuft (Skip 32,5–39,8 %).</w:t>
       </w:r>
     </w:p>
     <w:p>
@@ -586,7 +586,7 @@
         <w:br/>
       </w:r>
       <w:r>
-        <w:t xml:space="preserve">Zwei in der Pflege, 55 € Unterschied</w:t>
+        <w:t xml:space="preserve">Zwei Kolleginnen, 55 € Unterschied</w:t>
       </w:r>
     </w:p>
     <w:p>
@@ -604,7 +604,7 @@
         <w:br/>
       </w:r>
       <w:r>
-        <w:t xml:space="preserve">Z in Kasack, zwei Kaffeebecher nebeneinander: links ein 55-€-Schein, rechts ein 115-€-Schein. Z schiebt die zwei Becher zusammen, als wären es zwei Kolleginnen am Dienstzimmertisch.</w:t>
+        <w:t xml:space="preserve">Z im weißen Kittel am Teamtisch, zwei Kaffeebecher vor sich: links ein 55-€-Schein, rechts ein 115-€-Schein. Sie schiebt die Becher zusammen, als wären es zwei Kolleginnen in der Pause.</w:t>
       </w:r>
     </w:p>
     <w:p>
@@ -622,7 +622,7 @@
         <w:br/>
       </w:r>
       <w:r>
-        <w:t xml:space="preserve">Wiedererkennen („ich kenn das von meinen Mädels“), dann Aha. Warm, ruhig, kurze Sätze, kein Zeigefinger.</w:t>
+        <w:t xml:space="preserve">Wiedererkennen („kenn ich aus meinem Team“), dann Aha. Warm, ruhig, kurze Sätze, kein Zeigefinger.</w:t>
       </w:r>
     </w:p>
     <w:p>
@@ -640,7 +640,7 @@
         <w:br/>
       </w:r>
       <w:r>
-        <w:t xml:space="preserve">Gesprochen: „Zwei Pflegekräfte, gleicher Dienstplan.“</w:t>
+        <w:t xml:space="preserve">Gesprochen: „Zwei Kolleginnen, gleicher Dienstplan.“</w:t>
       </w:r>
       <w:r>
         <w:br/>
@@ -652,7 +652,7 @@
         <w:br/>
       </w:r>
       <w:r>
-        <w:t xml:space="preserve">Bild: Z hinter den zwei Bechern, Stationsflur im Hintergrund unscharf.</w:t>
+        <w:t xml:space="preserve">Bild: Z am Teamtisch, Praxis- oder Klinikflur unscharf im Hintergrund.</w:t>
       </w:r>
     </w:p>
     <w:p>
@@ -718,7 +718,7 @@
         <w:br/>
       </w:r>
       <w:r>
-        <w:t xml:space="preserve">„Schick das deiner Stationskollegin.“</w:t>
+        <w:t xml:space="preserve">„Schick das der Kollegin, die immer sagt, dafür bleibt kein Geld.“</w:t>
       </w:r>
     </w:p>
     <w:p>
@@ -736,13 +736,13 @@
         <w:br/>
       </w:r>
       <w:r>
-        <w:t xml:space="preserve">Ihr rennt für andere, wer rennt für euch? 🩺 55 € weniger Netto, 115 € im Vertrag. Bei kirchlichen Trägern und im öffentlichen Dienst gelten oft andere Regeln, schau bei dir nach ;)</w:t>
-      </w:r>
-      <w:r>
-        <w:br/>
-      </w:r>
-      <w:r>
-        <w:t xml:space="preserve">#pflege #betriebsrente #finanzmedizin</w:t>
+        <w:t xml:space="preserve">Wer kennt‘s nicht, im Team macht jede was anderes mit dem Gehalt 🩺 55 € weniger Netto, 115 € im Vertrag. Bei kirchlichen Trägern und im öffentlichen Dienst gelten oft andere Regeln, schau bei dir nach ;)</w:t>
+      </w:r>
+      <w:r>
+        <w:br/>
+      </w:r>
+      <w:r>
+        <w:t xml:space="preserve">#heilberufe #betriebsrente #finanzmedizin</w:t>
       </w:r>
     </w:p>
     <w:p>

</xml_diff>